<commit_message>
po i e ii
</commit_message>
<xml_diff>
--- a/projeto/projeto_pesquisa_esalq_afonso_brandao_222.docx
+++ b/projeto/projeto_pesquisa_esalq_afonso_brandao_222.docx
@@ -389,6 +389,11 @@
                   <w:listItem w:displayText="MBA Gestão Tributária" w:value="MBA Gestão Tributária"/>
                 </w:comboBox>
               </w:sdtPr>
+              <w:sdtEndPr>
+                <w:rPr>
+                  <w:rStyle w:val="Estilo2"/>
+                </w:rPr>
+              </w:sdtEndPr>
               <w:sdtContent>
                 <w:r>
                   <w:rPr>
@@ -462,6 +467,11 @@
                   <w:listItem w:displayText="Distância" w:value="Distância"/>
                 </w:comboBox>
               </w:sdtPr>
+              <w:sdtEndPr>
+                <w:rPr>
+                  <w:rStyle w:val="Estilo2"/>
+                </w:rPr>
+              </w:sdtEndPr>
               <w:sdtContent>
                 <w:proofErr w:type="spellStart"/>
                 <w:r>
@@ -665,6 +675,7 @@
     <w:p>
       <w:pPr>
         <w:spacing w:after="40"/>
+        <w:ind w:firstLine="357"/>
         <w:rPr>
           <w:rFonts w:ascii="Arial" w:hAnsi="Arial" w:cs="Arial"/>
           <w:bCs/>
@@ -738,6 +749,7 @@
     <w:p>
       <w:pPr>
         <w:spacing w:after="80"/>
+        <w:ind w:firstLine="360"/>
         <w:jc w:val="both"/>
         <w:rPr>
           <w:rFonts w:ascii="Arial" w:hAnsi="Arial" w:cs="Arial"/>
@@ -755,7 +767,7 @@
           <w:szCs w:val="22"/>
           <w:lang w:val="pt-BR"/>
         </w:rPr>
-        <w:t>O rápido avanço da tecnologia impactou significativamente vários setores da sociedade, incluindo educação, saúde e negócios. Este projeto visa explorar a influência da tecnologia no setor empresarial, focando particularmente em como ela revolucionou as operações e estratégias empresariais tradicionais. O estudo se aprofundará nas diversas ferramentas e plataformas tecnológicas que as empresas utilizam para aprimorar suas operações, melhorar o atendimento ao cliente e obter vantagem competitiva no mercado. O projeto também examinará os desafios que as empresas enfrentam na integração da tecnologia nas suas operações e proporá estratégias para superar esses obstáculos. Este estudo é crucial na atual era digital, onde a tecnologia desempenha um papel fundamental no sucesso dos negócios</w:t>
+        <w:t>A era digital e tecnológica tem reconfigurado as dinâmicas em diversos setores da sociedade. No mundo corporativo, essas transformações têm aberto portas para novos paradigmas e formas de operar. Uma manifestação significativa é a crescente inserção da inteligência artificial na indústria brasileira, notavelmente na região do Espírito Santo, conforme destacado por Rocha (2023).</w:t>
       </w:r>
       <w:r>
         <w:rPr>
@@ -765,12 +777,93 @@
           <w:szCs w:val="22"/>
           <w:lang w:val="pt-BR"/>
         </w:rPr>
-        <w:t>.</w:t>
+        <w:t xml:space="preserve"> </w:t>
+      </w:r>
+      <w:r>
+        <w:rPr>
+          <w:rFonts w:ascii="Arial" w:hAnsi="Arial" w:cs="Arial"/>
+          <w:bCs/>
+          <w:sz w:val="22"/>
+          <w:szCs w:val="22"/>
+          <w:lang w:val="pt-BR"/>
+        </w:rPr>
+        <w:t xml:space="preserve">Concomitantemente, à medida que a integração tecnológica avança, surge a demanda por competências especializadas para a gestão de projetos ágeis, sobretudo na área de tecnologia da informação. Nesse contexto, da Costa Filho et al. (2022) identificam a necessidade de habilidades específicas para a condução eficaz de atividades em projetos ágeis. Em uma linha similar, Ribeiro &amp; </w:t>
+      </w:r>
+      <w:proofErr w:type="spellStart"/>
+      <w:r>
+        <w:rPr>
+          <w:rFonts w:ascii="Arial" w:hAnsi="Arial" w:cs="Arial"/>
+          <w:bCs/>
+          <w:sz w:val="22"/>
+          <w:szCs w:val="22"/>
+          <w:lang w:val="pt-BR"/>
+        </w:rPr>
+        <w:t>Araujo</w:t>
+      </w:r>
+      <w:proofErr w:type="spellEnd"/>
+      <w:r>
+        <w:rPr>
+          <w:rFonts w:ascii="Arial" w:hAnsi="Arial" w:cs="Arial"/>
+          <w:bCs/>
+          <w:sz w:val="22"/>
+          <w:szCs w:val="22"/>
+          <w:lang w:val="pt-BR"/>
+        </w:rPr>
+        <w:t xml:space="preserve"> (2023) sublinham a importância das competências coletivas, indicando a imperatividade de uma visão holística na gestão de projetos tecnológicos.</w:t>
       </w:r>
     </w:p>
     <w:p>
       <w:pPr>
         <w:spacing w:after="80"/>
+        <w:ind w:firstLine="360"/>
+        <w:jc w:val="both"/>
+        <w:rPr>
+          <w:rFonts w:ascii="Arial" w:hAnsi="Arial" w:cs="Arial"/>
+          <w:bCs/>
+          <w:sz w:val="22"/>
+          <w:szCs w:val="22"/>
+          <w:lang w:val="pt-BR"/>
+        </w:rPr>
+      </w:pPr>
+      <w:r>
+        <w:rPr>
+          <w:rFonts w:ascii="Arial" w:hAnsi="Arial" w:cs="Arial"/>
+          <w:bCs/>
+          <w:sz w:val="22"/>
+          <w:szCs w:val="22"/>
+          <w:lang w:val="pt-BR"/>
+        </w:rPr>
+        <w:t>A incorporação de tecnologias avançadas nas operações empresariais, embora promissora, traz consigo desafios inéditos. Uma dessas questões emergentes é a otimização da alocação de recursos. A tarefa de alocar recursos de forma eficaz é complexa e multifacetada, abrangendo desde a definição clara dos objetivos estratégicos até o entendimento das peculiaridades dos recursos disponíveis. A dificuldade é ampliada quando se considera a velocidade e a volatilidade do ambiente empresarial atual, marcado por mudanças rápidas e frequentes interrupções.</w:t>
+      </w:r>
+    </w:p>
+    <w:p>
+      <w:pPr>
+        <w:spacing w:after="80"/>
+        <w:ind w:firstLine="360"/>
+        <w:jc w:val="both"/>
+        <w:rPr>
+          <w:rFonts w:ascii="Arial" w:hAnsi="Arial" w:cs="Arial"/>
+          <w:bCs/>
+          <w:sz w:val="22"/>
+          <w:szCs w:val="22"/>
+          <w:lang w:val="pt-BR"/>
+        </w:rPr>
+      </w:pPr>
+      <w:r>
+        <w:rPr>
+          <w:rFonts w:ascii="Arial" w:hAnsi="Arial" w:cs="Arial"/>
+          <w:bCs/>
+          <w:sz w:val="22"/>
+          <w:szCs w:val="22"/>
+          <w:lang w:val="pt-BR"/>
+        </w:rPr>
+        <w:t>Além disso, enquanto as abordagens tradicionais de gestão de recursos tendem a ser lineares e determinísticas, o ambiente dinâmico atual exige soluções mais flexíveis e adaptativas. Nesse cenário, os algoritmos genéticos emergem como uma possível solução, dada a sua capacidade de buscar soluções ótimas em espaços de solução vastos e complexos. No entanto, a sua aplicação na alocação de recursos empresariais ainda é incipiente, criando um vácuo tanto em termos práticos quanto acadêmicos.</w:t>
+      </w:r>
+    </w:p>
+    <w:p>
+      <w:pPr>
+        <w:spacing w:after="80"/>
+        <w:ind w:firstLine="360"/>
         <w:jc w:val="both"/>
         <w:rPr>
           <w:rFonts w:ascii="Arial" w:hAnsi="Arial" w:cs="Arial"/>
@@ -830,6 +923,7 @@
     <w:p>
       <w:pPr>
         <w:spacing w:after="80"/>
+        <w:ind w:firstLine="360"/>
         <w:jc w:val="both"/>
         <w:rPr>
           <w:rFonts w:ascii="Arial" w:hAnsi="Arial" w:cs="Arial"/>
@@ -873,6 +967,7 @@
     <w:p>
       <w:pPr>
         <w:spacing w:after="80"/>
+        <w:ind w:firstLine="360"/>
         <w:jc w:val="both"/>
         <w:rPr>
           <w:rFonts w:ascii="Arial" w:hAnsi="Arial" w:cs="Arial"/>
@@ -890,7 +985,18 @@
           <w:szCs w:val="22"/>
           <w:lang w:val="pt-BR"/>
         </w:rPr>
-        <w:t>A ideia é que, ao serem alocados para ministrar módulos fora de suas áreas de especialização, os professores possam expandir seus conhecimentos e habilidades, o que, por sua vez, pode enriquecer o processo de ensino e aprendizagem. Além disso, a utilização de um algoritmo genético para a alocação de professores pode contribuir para uma distribuição mais equitativa e eficiente dos docentes nos cursos, levando em consideração não apenas as necessidades dos cursos, mas também as competências e o desenvolvimento profissional dos professores</w:t>
+        <w:t xml:space="preserve">A ideia é que, ao serem alocados para ministrar módulos fora de suas áreas de especialização, os professores possam expandir seus conhecimentos e habilidades, o que, por sua vez, pode enriquecer o processo de ensino e aprendizagem. Além disso, a utilização de um algoritmo genético para a alocação de professores pode contribuir para uma distribuição mais equitativa e eficiente dos docentes nos cursos, levando em consideração </w:t>
+      </w:r>
+      <w:r>
+        <w:rPr>
+          <w:rFonts w:ascii="Arial" w:hAnsi="Arial" w:cs="Arial"/>
+          <w:bCs/>
+          <w:sz w:val="22"/>
+          <w:szCs w:val="22"/>
+          <w:lang w:val="pt-BR"/>
+        </w:rPr>
+        <w:lastRenderedPageBreak/>
+        <w:t>não apenas as necessidades dos cursos, mas também as competências e o desenvolvimento profissional dos professores</w:t>
       </w:r>
     </w:p>
     <w:p>
@@ -963,6 +1069,7 @@
     </w:p>
     <w:p>
       <w:pPr>
+        <w:ind w:firstLine="360"/>
         <w:jc w:val="both"/>
         <w:rPr>
           <w:rFonts w:ascii="Arial" w:hAnsi="Arial" w:cs="Arial"/>
@@ -995,6 +1102,7 @@
     </w:p>
     <w:p>
       <w:pPr>
+        <w:ind w:firstLine="360"/>
         <w:jc w:val="both"/>
         <w:rPr>
           <w:rFonts w:ascii="Arial" w:hAnsi="Arial" w:cs="Arial"/>
@@ -1027,6 +1135,7 @@
     </w:p>
     <w:p>
       <w:pPr>
+        <w:ind w:firstLine="360"/>
         <w:jc w:val="both"/>
         <w:rPr>
           <w:rFonts w:ascii="Arial" w:hAnsi="Arial" w:cs="Arial"/>
@@ -1044,7 +1153,6 @@
           <w:szCs w:val="22"/>
           <w:lang w:val="pt-BR"/>
         </w:rPr>
-        <w:lastRenderedPageBreak/>
         <w:t>A configuração dos parâmetros do algoritmo genético e os procedimentos de avaliação foram realizados de acordo com as características específicas do cenário e os dados disponíveis. O objetivo principal é permitir que os professores expandam suas competências ministrando módulos diferentes dos quais são especialistas, ao mesmo tempo em que mantêm sua carga horária</w:t>
       </w:r>
       <w:r>
@@ -1057,10 +1165,7 @@
         </w:rPr>
         <w:t>.</w:t>
       </w:r>
-    </w:p>
-    <w:p>
-      <w:pPr>
-        <w:jc w:val="both"/>
+      <w:r>
         <w:rPr>
           <w:rFonts w:ascii="Arial" w:hAnsi="Arial" w:cs="Arial"/>
           <w:bCs/>
@@ -1068,7 +1173,8 @@
           <w:szCs w:val="22"/>
           <w:lang w:val="pt-BR"/>
         </w:rPr>
-      </w:pPr>
+        <w:t xml:space="preserve"> </w:t>
+      </w:r>
       <w:r>
         <w:rPr>
           <w:rFonts w:ascii="Arial" w:hAnsi="Arial" w:cs="Arial"/>
@@ -1163,6 +1269,7 @@
     </w:p>
     <w:p>
       <w:pPr>
+        <w:ind w:firstLine="360"/>
         <w:jc w:val="both"/>
         <w:rPr>
           <w:rFonts w:ascii="Arial" w:hAnsi="Arial" w:cs="Arial"/>
@@ -1175,26 +1282,25 @@
           <w:lang w:val="pt-BR"/>
         </w:rPr>
         <w:t>Espera-se que a aplicação do algoritmo genético para a alocação de professores em cursos multimodulares resulte em uma distribuição mais equilibrada e eficiente dos docentes. A diversificação das competências dos professores é um dos principais resultados esperados, permitindo que os docentes expandam suas habilidades e contribuam de forma mais abrangente para o processo educacional.</w:t>
+      </w:r>
+      <w:r>
+        <w:rPr>
+          <w:rFonts w:ascii="Arial" w:hAnsi="Arial" w:cs="Arial"/>
+          <w:lang w:val="pt-BR"/>
+        </w:rPr>
+        <w:t xml:space="preserve"> </w:t>
+      </w:r>
+      <w:r>
+        <w:rPr>
+          <w:rFonts w:ascii="Arial" w:hAnsi="Arial" w:cs="Arial"/>
+          <w:lang w:val="pt-BR"/>
+        </w:rPr>
+        <w:t>Além disso, espera-se que a alocação otimizada de professores promova um ambiente de ensino dinâmico e adaptável, onde os docentes possam se adaptar às novas demandas de ensino. Isso pode resultar em um aumento na qualidade do ensino e na satisfação dos alunos, bem como na melhoria do desempenho acadêmico.</w:t>
       </w:r>
     </w:p>
     <w:p>
       <w:pPr>
-        <w:jc w:val="both"/>
-        <w:rPr>
-          <w:rFonts w:ascii="Arial" w:hAnsi="Arial" w:cs="Arial"/>
-          <w:lang w:val="pt-BR"/>
-        </w:rPr>
-      </w:pPr>
-      <w:r>
-        <w:rPr>
-          <w:rFonts w:ascii="Arial" w:hAnsi="Arial" w:cs="Arial"/>
-          <w:lang w:val="pt-BR"/>
-        </w:rPr>
-        <w:t>Além disso, espera-se que a alocação otimizada de professores promova um ambiente de ensino dinâmico e adaptável, onde os docentes possam se adaptar às novas demandas de ensino. Isso pode resultar em um aumento na qualidade do ensino e na satisfação dos alunos, bem como na melhoria do desempenho acadêmico.</w:t>
-      </w:r>
-    </w:p>
-    <w:p>
-      <w:pPr>
+        <w:ind w:firstLine="357"/>
         <w:jc w:val="both"/>
         <w:rPr>
           <w:rFonts w:ascii="Arial" w:hAnsi="Arial" w:cs="Arial"/>
@@ -2894,6 +3000,7 @@
                 <w:szCs w:val="18"/>
                 <w:lang w:val="pt-BR"/>
               </w:rPr>
+              <w:lastRenderedPageBreak/>
               <w:t>Comparação dos resultados obtidos com os trabalhos existentes na literatura</w:t>
             </w:r>
           </w:p>
@@ -4089,7 +4196,6 @@
                 <w:szCs w:val="18"/>
                 <w:lang w:val="pt-BR"/>
               </w:rPr>
-              <w:lastRenderedPageBreak/>
               <w:t>Ensaio da apresentação para garantir a fluência e a clareza</w:t>
             </w:r>
           </w:p>
@@ -4768,49 +4874,24 @@
     <w:p>
       <w:pPr>
         <w:ind w:left="360"/>
-      </w:pPr>
-      <w:r>
-        <w:rPr>
-          <w:lang w:val="pt-BR"/>
-        </w:rPr>
-        <w:t>1.</w:t>
-      </w:r>
-      <w:r>
-        <w:rPr>
-          <w:lang w:val="pt-BR"/>
-        </w:rPr>
-        <w:tab/>
-        <w:t xml:space="preserve">Rocha, </w:t>
-      </w:r>
-      <w:proofErr w:type="spellStart"/>
-      <w:r>
-        <w:rPr>
-          <w:lang w:val="pt-BR"/>
-        </w:rPr>
-        <w:t>Wyctor</w:t>
-      </w:r>
-      <w:proofErr w:type="spellEnd"/>
-      <w:r>
-        <w:rPr>
-          <w:lang w:val="pt-BR"/>
-        </w:rPr>
-        <w:t xml:space="preserve"> Fogos da. "Revisão bibliográfica do uso de inteligência artificial na indústria nacional brasileira e regional do Espírito Santo." </w:t>
-      </w:r>
-      <w:r>
-        <w:t>(2023).</w:t>
+        <w:rPr>
+          <w:lang w:val="pt-BR"/>
+        </w:rPr>
+      </w:pPr>
+      <w:r>
+        <w:rPr>
+          <w:lang w:val="pt-BR"/>
+        </w:rPr>
+        <w:t>ROCHA, W. F. da. (2023). Revisão bibliográfica do uso de inteligência artificial na indústria nacional brasileira e regional do Espírito Santo.</w:t>
       </w:r>
     </w:p>
     <w:p>
       <w:pPr>
         <w:ind w:left="360"/>
-      </w:pPr>
-      <w:r>
-        <w:t>2.</w:t>
-      </w:r>
-      <w:r>
-        <w:tab/>
-        <w:t>da Costa Filho, José Romualdo, et al. "Competencies for managing activities in agile pro-jects." Global Journal of Flexible Systems Management 23.4 (2022): 431-452.</w:t>
-      </w:r>
+        <w:rPr>
+          <w:lang w:val="pt-BR"/>
+        </w:rPr>
+      </w:pPr>
     </w:p>
     <w:p>
       <w:pPr>
@@ -4823,42 +4904,80 @@
         <w:rPr>
           <w:lang w:val="pt-BR"/>
         </w:rPr>
-        <w:t>3.</w:t>
-      </w:r>
-      <w:r>
-        <w:rPr>
-          <w:lang w:val="pt-BR"/>
-        </w:rPr>
-        <w:tab/>
-        <w:t xml:space="preserve">Ribeiro, Iasmim Cruz, </w:t>
+        <w:t xml:space="preserve">da COSTA FILHO, J. R. et al. </w:t>
+      </w:r>
+      <w:r>
+        <w:t xml:space="preserve">(2022). Competencies for managing activities in agile projects. </w:t>
+      </w:r>
+      <w:r>
+        <w:rPr>
+          <w:lang w:val="pt-BR"/>
+        </w:rPr>
+        <w:t xml:space="preserve">Global </w:t>
       </w:r>
       <w:proofErr w:type="spellStart"/>
       <w:r>
         <w:rPr>
           <w:lang w:val="pt-BR"/>
         </w:rPr>
-        <w:t>and</w:t>
+        <w:t>Journal</w:t>
       </w:r>
       <w:proofErr w:type="spellEnd"/>
       <w:r>
         <w:rPr>
           <w:lang w:val="pt-BR"/>
         </w:rPr>
-        <w:t xml:space="preserve"> José Braz de </w:t>
+        <w:t xml:space="preserve"> </w:t>
       </w:r>
       <w:proofErr w:type="spellStart"/>
       <w:r>
         <w:rPr>
           <w:lang w:val="pt-BR"/>
         </w:rPr>
-        <w:t>Araujo</w:t>
+        <w:t>of</w:t>
       </w:r>
       <w:proofErr w:type="spellEnd"/>
       <w:r>
         <w:rPr>
           <w:lang w:val="pt-BR"/>
         </w:rPr>
-        <w:t>. "Competências coletivas nos projetos da área de tecnologia da informação: uma revisão sistemática da literatura." Revista de Gestão e Projetos 14.1 (2023): 219-271.</w:t>
+        <w:t xml:space="preserve"> </w:t>
+      </w:r>
+      <w:proofErr w:type="spellStart"/>
+      <w:r>
+        <w:rPr>
+          <w:lang w:val="pt-BR"/>
+        </w:rPr>
+        <w:t>Flexible</w:t>
+      </w:r>
+      <w:proofErr w:type="spellEnd"/>
+      <w:r>
+        <w:rPr>
+          <w:lang w:val="pt-BR"/>
+        </w:rPr>
+        <w:t xml:space="preserve"> Systems Management, 23(4), 431-452.</w:t>
+      </w:r>
+    </w:p>
+    <w:p>
+      <w:pPr>
+        <w:ind w:left="360"/>
+        <w:rPr>
+          <w:lang w:val="pt-BR"/>
+        </w:rPr>
+      </w:pPr>
+    </w:p>
+    <w:p>
+      <w:pPr>
+        <w:ind w:left="360"/>
+        <w:rPr>
+          <w:lang w:val="pt-BR"/>
+        </w:rPr>
+      </w:pPr>
+      <w:r>
+        <w:rPr>
+          <w:lang w:val="pt-BR"/>
+        </w:rPr>
+        <w:t>RIBEIRO, I. C., &amp; ARAUJO, J. B. de. (2023). Competências coletivas nos projetos da área de tecnologia da informação: uma revisão sistemática da literatura. Revista de Gestão e Projetos, 14(1), 219-271.</w:t>
       </w:r>
     </w:p>
     <w:sectPr>
@@ -5393,6 +5512,92 @@
       </w:pPr>
     </w:lvl>
   </w:abstractNum>
+  <w:abstractNum w:abstractNumId="3" w15:restartNumberingAfterBreak="0">
+    <w:nsid w:val="7D4B0915"/>
+    <w:multiLevelType w:val="hybridMultilevel"/>
+    <w:tmpl w:val="12DCD138"/>
+    <w:lvl w:ilvl="0" w:tplc="0416000F">
+      <w:start w:val="1"/>
+      <w:numFmt w:val="decimal"/>
+      <w:lvlText w:val="%1."/>
+      <w:lvlJc w:val="left"/>
+      <w:pPr>
+        <w:ind w:left="720" w:hanging="360"/>
+      </w:pPr>
+    </w:lvl>
+    <w:lvl w:ilvl="1" w:tplc="04160019" w:tentative="1">
+      <w:start w:val="1"/>
+      <w:numFmt w:val="lowerLetter"/>
+      <w:lvlText w:val="%2."/>
+      <w:lvlJc w:val="left"/>
+      <w:pPr>
+        <w:ind w:left="1440" w:hanging="360"/>
+      </w:pPr>
+    </w:lvl>
+    <w:lvl w:ilvl="2" w:tplc="0416001B" w:tentative="1">
+      <w:start w:val="1"/>
+      <w:numFmt w:val="lowerRoman"/>
+      <w:lvlText w:val="%3."/>
+      <w:lvlJc w:val="right"/>
+      <w:pPr>
+        <w:ind w:left="2160" w:hanging="180"/>
+      </w:pPr>
+    </w:lvl>
+    <w:lvl w:ilvl="3" w:tplc="0416000F" w:tentative="1">
+      <w:start w:val="1"/>
+      <w:numFmt w:val="decimal"/>
+      <w:lvlText w:val="%4."/>
+      <w:lvlJc w:val="left"/>
+      <w:pPr>
+        <w:ind w:left="2880" w:hanging="360"/>
+      </w:pPr>
+    </w:lvl>
+    <w:lvl w:ilvl="4" w:tplc="04160019" w:tentative="1">
+      <w:start w:val="1"/>
+      <w:numFmt w:val="lowerLetter"/>
+      <w:lvlText w:val="%5."/>
+      <w:lvlJc w:val="left"/>
+      <w:pPr>
+        <w:ind w:left="3600" w:hanging="360"/>
+      </w:pPr>
+    </w:lvl>
+    <w:lvl w:ilvl="5" w:tplc="0416001B" w:tentative="1">
+      <w:start w:val="1"/>
+      <w:numFmt w:val="lowerRoman"/>
+      <w:lvlText w:val="%6."/>
+      <w:lvlJc w:val="right"/>
+      <w:pPr>
+        <w:ind w:left="4320" w:hanging="180"/>
+      </w:pPr>
+    </w:lvl>
+    <w:lvl w:ilvl="6" w:tplc="0416000F" w:tentative="1">
+      <w:start w:val="1"/>
+      <w:numFmt w:val="decimal"/>
+      <w:lvlText w:val="%7."/>
+      <w:lvlJc w:val="left"/>
+      <w:pPr>
+        <w:ind w:left="5040" w:hanging="360"/>
+      </w:pPr>
+    </w:lvl>
+    <w:lvl w:ilvl="7" w:tplc="04160019" w:tentative="1">
+      <w:start w:val="1"/>
+      <w:numFmt w:val="lowerLetter"/>
+      <w:lvlText w:val="%8."/>
+      <w:lvlJc w:val="left"/>
+      <w:pPr>
+        <w:ind w:left="5760" w:hanging="360"/>
+      </w:pPr>
+    </w:lvl>
+    <w:lvl w:ilvl="8" w:tplc="0416001B" w:tentative="1">
+      <w:start w:val="1"/>
+      <w:numFmt w:val="lowerRoman"/>
+      <w:lvlText w:val="%9."/>
+      <w:lvlJc w:val="right"/>
+      <w:pPr>
+        <w:ind w:left="6480" w:hanging="180"/>
+      </w:pPr>
+    </w:lvl>
+  </w:abstractNum>
   <w:num w:numId="1" w16cid:durableId="68771878">
     <w:abstractNumId w:val="2"/>
   </w:num>
@@ -5401,6 +5606,9 @@
   </w:num>
   <w:num w:numId="3" w16cid:durableId="1627391756">
     <w:abstractNumId w:val="1"/>
+  </w:num>
+  <w:num w:numId="4" w16cid:durableId="405422077">
+    <w:abstractNumId w:val="3"/>
   </w:num>
 </w:numbering>
 </file>

</xml_diff>